<commit_message>
:memo: docs: Correção de trecho do artigo
</commit_message>
<xml_diff>
--- a/docs/artigo.docx
+++ b/docs/artigo.docx
@@ -636,7 +636,19 @@
         <w:rPr>
           <w:lang w:val="pt-BR"/>
         </w:rPr>
-        <w:t xml:space="preserve"> e colegas (2023) e Kumari et al. (2022). Por outro lado, métodos atualizados passaram a explorar fontes pouco convencionais: padrões digitais ou registros fora do comum começam a ser aproveitados para enriquecer a análise preditiva, tal como mostrou James em 2021.</w:t>
+        <w:t xml:space="preserve"> e</w:t>
+      </w:r>
+      <w:r>
+        <w:rPr>
+          <w:lang w:val="pt-BR"/>
+        </w:rPr>
+        <w:t xml:space="preserve">t al. </w:t>
+      </w:r>
+      <w:r>
+        <w:rPr>
+          <w:lang w:val="pt-BR"/>
+        </w:rPr>
+        <w:t>(2023) e Kumari et al. (2022). Por outro lado, métodos atualizados passaram a explorar fontes pouco convencionais: padrões digitais ou registros fora do comum começam a ser aproveitados para enriquecer a análise preditiva, tal como mostrou James em 2021.</w:t>
       </w:r>
     </w:p>
     <w:p>
@@ -1125,7 +1137,6 @@
             <w:id w:val="-573587230"/>
             <w:bibliography/>
           </w:sdtPr>
-          <w:sdtEndPr/>
           <w:sdtContent>
             <w:p>
               <w:pPr>
@@ -1174,99 +1185,25 @@
                   <w:lang w:val="pt-BR"/>
                 </w:rPr>
               </w:pPr>
-              <w:proofErr w:type="spellStart"/>
-              <w:r>
-                <w:rPr>
-                  <w:lang w:val="pt-BR"/>
-                </w:rPr>
-                <w:t>Babaei</w:t>
-              </w:r>
-              <w:proofErr w:type="spellEnd"/>
-              <w:r>
-                <w:rPr>
-                  <w:lang w:val="pt-BR"/>
-                </w:rPr>
-                <w:t xml:space="preserve">, G.; </w:t>
-              </w:r>
-              <w:proofErr w:type="spellStart"/>
-              <w:r>
-                <w:rPr>
-                  <w:lang w:val="pt-BR"/>
-                </w:rPr>
-                <w:t>Pagnottoni</w:t>
-              </w:r>
-              <w:proofErr w:type="spellEnd"/>
-              <w:r>
-                <w:rPr>
-                  <w:lang w:val="pt-BR"/>
-                </w:rPr>
-                <w:t xml:space="preserve">, P.; Do, T. T. </w:t>
-              </w:r>
-              <w:proofErr w:type="spellStart"/>
+              <w:r>
+                <w:rPr>
+                  <w:lang w:val="pt-BR"/>
+                </w:rPr>
+                <w:t xml:space="preserve">Babaei, G.; Pagnottoni, P.; Do, T. T. </w:t>
+              </w:r>
               <w:r>
                 <w:rPr>
                   <w:b/>
                   <w:bCs/>
                   <w:lang w:val="pt-BR"/>
                 </w:rPr>
-                <w:t>Explainable</w:t>
-              </w:r>
-              <w:proofErr w:type="spellEnd"/>
-              <w:r>
-                <w:rPr>
-                  <w:b/>
-                  <w:bCs/>
-                  <w:lang w:val="pt-BR"/>
-                </w:rPr>
-                <w:t xml:space="preserve"> machine learning for </w:t>
-              </w:r>
-              <w:proofErr w:type="spellStart"/>
-              <w:r>
-                <w:rPr>
-                  <w:b/>
-                  <w:bCs/>
-                  <w:lang w:val="pt-BR"/>
-                </w:rPr>
-                <w:t>lending</w:t>
-              </w:r>
-              <w:proofErr w:type="spellEnd"/>
-              <w:r>
-                <w:rPr>
-                  <w:b/>
-                  <w:bCs/>
-                  <w:lang w:val="pt-BR"/>
-                </w:rPr>
-                <w:t xml:space="preserve"> default </w:t>
-              </w:r>
-              <w:proofErr w:type="spellStart"/>
-              <w:r>
-                <w:rPr>
-                  <w:b/>
-                  <w:bCs/>
-                  <w:lang w:val="pt-BR"/>
-                </w:rPr>
-                <w:t>classification</w:t>
-              </w:r>
-              <w:proofErr w:type="spellEnd"/>
-              <w:r>
-                <w:rPr>
-                  <w:lang w:val="pt-BR"/>
-                </w:rPr>
-                <w:t xml:space="preserve">. Chicago: </w:t>
-              </w:r>
-              <w:proofErr w:type="spellStart"/>
-              <w:r>
-                <w:rPr>
-                  <w:lang w:val="pt-BR"/>
-                </w:rPr>
-                <w:t>Sage</w:t>
-              </w:r>
-              <w:proofErr w:type="spellEnd"/>
-              <w:r>
-                <w:rPr>
-                  <w:lang w:val="pt-BR"/>
-                </w:rPr>
-                <w:t xml:space="preserve"> Press, 2020.</w:t>
+                <w:t>Explainable machine learning for lending default classification</w:t>
+              </w:r>
+              <w:r>
+                <w:rPr>
+                  <w:lang w:val="pt-BR"/>
+                </w:rPr>
+                <w:t>. Chicago: Sage Press, 2020.</w:t>
               </w:r>
             </w:p>
             <w:p>
@@ -1275,155 +1212,19 @@
                   <w:lang w:val="pt-BR"/>
                 </w:rPr>
               </w:pPr>
-              <w:proofErr w:type="spellStart"/>
-              <w:r>
-                <w:rPr>
-                  <w:lang w:val="pt-BR"/>
-                </w:rPr>
-                <w:t>Caffo</w:t>
-              </w:r>
-              <w:proofErr w:type="spellEnd"/>
-              <w:r>
-                <w:rPr>
-                  <w:lang w:val="pt-BR"/>
-                </w:rPr>
-                <w:t>, B. S.; D’</w:t>
-              </w:r>
-              <w:proofErr w:type="spellStart"/>
-              <w:r>
-                <w:rPr>
-                  <w:lang w:val="pt-BR"/>
-                </w:rPr>
-                <w:t>Asaro</w:t>
-              </w:r>
-              <w:proofErr w:type="spellEnd"/>
-              <w:r>
-                <w:rPr>
-                  <w:lang w:val="pt-BR"/>
-                </w:rPr>
-                <w:t xml:space="preserve">, F. A.; Garcez, A.; </w:t>
-              </w:r>
-              <w:proofErr w:type="spellStart"/>
-              <w:r>
-                <w:rPr>
-                  <w:lang w:val="pt-BR"/>
-                </w:rPr>
-                <w:t>Raffinetti</w:t>
-              </w:r>
-              <w:proofErr w:type="spellEnd"/>
-              <w:r>
-                <w:rPr>
-                  <w:lang w:val="pt-BR"/>
-                </w:rPr>
-                <w:t xml:space="preserve">, E. </w:t>
-              </w:r>
-              <w:proofErr w:type="spellStart"/>
+              <w:r>
+                <w:rPr>
+                  <w:lang w:val="pt-BR"/>
+                </w:rPr>
+                <w:t xml:space="preserve">Caffo, B. S.; D’Asaro, F. A.; Garcez, A.; Raffinetti, E. </w:t>
+              </w:r>
               <w:r>
                 <w:rPr>
                   <w:b/>
                   <w:bCs/>
                   <w:lang w:val="pt-BR"/>
                 </w:rPr>
-                <w:t>Explainable</w:t>
-              </w:r>
-              <w:proofErr w:type="spellEnd"/>
-              <w:r>
-                <w:rPr>
-                  <w:b/>
-                  <w:bCs/>
-                  <w:lang w:val="pt-BR"/>
-                </w:rPr>
-                <w:t xml:space="preserve"> artificial </w:t>
-              </w:r>
-              <w:proofErr w:type="spellStart"/>
-              <w:r>
-                <w:rPr>
-                  <w:b/>
-                  <w:bCs/>
-                  <w:lang w:val="pt-BR"/>
-                </w:rPr>
-                <w:t>intelligence</w:t>
-              </w:r>
-              <w:proofErr w:type="spellEnd"/>
-              <w:r>
-                <w:rPr>
-                  <w:b/>
-                  <w:bCs/>
-                  <w:lang w:val="pt-BR"/>
-                </w:rPr>
-                <w:t xml:space="preserve"> models </w:t>
-              </w:r>
-              <w:proofErr w:type="spellStart"/>
-              <w:r>
-                <w:rPr>
-                  <w:b/>
-                  <w:bCs/>
-                  <w:lang w:val="pt-BR"/>
-                </w:rPr>
-                <w:t>and</w:t>
-              </w:r>
-              <w:proofErr w:type="spellEnd"/>
-              <w:r>
-                <w:rPr>
-                  <w:b/>
-                  <w:bCs/>
-                  <w:lang w:val="pt-BR"/>
-                </w:rPr>
-                <w:t xml:space="preserve"> </w:t>
-              </w:r>
-              <w:proofErr w:type="spellStart"/>
-              <w:r>
-                <w:rPr>
-                  <w:b/>
-                  <w:bCs/>
-                  <w:lang w:val="pt-BR"/>
-                </w:rPr>
-                <w:t>methods</w:t>
-              </w:r>
-              <w:proofErr w:type="spellEnd"/>
-              <w:r>
-                <w:rPr>
-                  <w:b/>
-                  <w:bCs/>
-                  <w:lang w:val="pt-BR"/>
-                </w:rPr>
-                <w:t xml:space="preserve"> in </w:t>
-              </w:r>
-              <w:proofErr w:type="spellStart"/>
-              <w:r>
-                <w:rPr>
-                  <w:b/>
-                  <w:bCs/>
-                  <w:lang w:val="pt-BR"/>
-                </w:rPr>
-                <w:t>finance</w:t>
-              </w:r>
-              <w:proofErr w:type="spellEnd"/>
-              <w:r>
-                <w:rPr>
-                  <w:b/>
-                  <w:bCs/>
-                  <w:lang w:val="pt-BR"/>
-                </w:rPr>
-                <w:t xml:space="preserve"> </w:t>
-              </w:r>
-              <w:proofErr w:type="spellStart"/>
-              <w:r>
-                <w:rPr>
-                  <w:b/>
-                  <w:bCs/>
-                  <w:lang w:val="pt-BR"/>
-                </w:rPr>
-                <w:t>and</w:t>
-              </w:r>
-              <w:proofErr w:type="spellEnd"/>
-              <w:r>
-                <w:rPr>
-                  <w:b/>
-                  <w:bCs/>
-                  <w:lang w:val="pt-BR"/>
-                </w:rPr>
-                <w:t xml:space="preserve"> healthcare</w:t>
+                <w:t>Explainable artificial intelligence models and methods in finance and healthcare</w:t>
               </w:r>
               <w:r>
                 <w:rPr>
@@ -1431,34 +1232,14 @@
                 </w:rPr>
                 <w:t xml:space="preserve">. </w:t>
               </w:r>
-              <w:proofErr w:type="spellStart"/>
               <w:r>
                 <w:rPr>
                   <w:i/>
                   <w:iCs/>
                   <w:lang w:val="pt-BR"/>
                 </w:rPr>
-                <w:t>Frontiers</w:t>
-              </w:r>
-              <w:proofErr w:type="spellEnd"/>
-              <w:r>
-                <w:rPr>
-                  <w:i/>
-                  <w:iCs/>
-                  <w:lang w:val="pt-BR"/>
-                </w:rPr>
-                <w:t xml:space="preserve"> in Artificial </w:t>
-              </w:r>
-              <w:proofErr w:type="spellStart"/>
-              <w:r>
-                <w:rPr>
-                  <w:i/>
-                  <w:iCs/>
-                  <w:lang w:val="pt-BR"/>
-                </w:rPr>
-                <w:t>Intelligence</w:t>
-              </w:r>
-              <w:proofErr w:type="spellEnd"/>
+                <w:t>Frontiers in Artificial Intelligence</w:t>
+              </w:r>
               <w:r>
                 <w:rPr>
                   <w:lang w:val="pt-BR"/>
@@ -1472,89 +1253,11 @@
                   <w:lang w:val="pt-BR"/>
                 </w:rPr>
               </w:pPr>
-              <w:proofErr w:type="spellStart"/>
-              <w:r>
-                <w:rPr>
-                  <w:lang w:val="pt-BR"/>
-                </w:rPr>
-                <w:t>Chouksey</w:t>
-              </w:r>
-              <w:proofErr w:type="spellEnd"/>
-              <w:r>
-                <w:rPr>
-                  <w:lang w:val="pt-BR"/>
-                </w:rPr>
-                <w:t xml:space="preserve">, A.; </w:t>
-              </w:r>
-              <w:proofErr w:type="spellStart"/>
-              <w:r>
-                <w:rPr>
-                  <w:lang w:val="pt-BR"/>
-                </w:rPr>
-                <w:t>Shovon</w:t>
-              </w:r>
-              <w:proofErr w:type="spellEnd"/>
-              <w:r>
-                <w:rPr>
-                  <w:lang w:val="pt-BR"/>
-                </w:rPr>
-                <w:t xml:space="preserve">, M. S. S.; </w:t>
-              </w:r>
-              <w:proofErr w:type="spellStart"/>
-              <w:r>
-                <w:rPr>
-                  <w:lang w:val="pt-BR"/>
-                </w:rPr>
-                <w:t>Tannier</w:t>
-              </w:r>
-              <w:proofErr w:type="spellEnd"/>
-              <w:r>
-                <w:rPr>
-                  <w:lang w:val="pt-BR"/>
-                </w:rPr>
-                <w:t xml:space="preserve">, N. R.; </w:t>
-              </w:r>
-              <w:proofErr w:type="spellStart"/>
-              <w:r>
-                <w:rPr>
-                  <w:lang w:val="pt-BR"/>
-                </w:rPr>
-                <w:t>Bhowmik</w:t>
-              </w:r>
-              <w:proofErr w:type="spellEnd"/>
-              <w:r>
-                <w:rPr>
-                  <w:lang w:val="pt-BR"/>
-                </w:rPr>
-                <w:t xml:space="preserve">, P. K.; </w:t>
-              </w:r>
-              <w:proofErr w:type="spellStart"/>
-              <w:r>
-                <w:rPr>
-                  <w:lang w:val="pt-BR"/>
-                </w:rPr>
-                <w:t>Hossain</w:t>
-              </w:r>
-              <w:proofErr w:type="spellEnd"/>
-              <w:r>
-                <w:rPr>
-                  <w:lang w:val="pt-BR"/>
-                </w:rPr>
-                <w:t xml:space="preserve">, M.; Rahman, M. S.; Rahman, M. K.; </w:t>
-              </w:r>
-              <w:proofErr w:type="spellStart"/>
-              <w:r>
-                <w:rPr>
-                  <w:lang w:val="pt-BR"/>
-                </w:rPr>
-                <w:t>Hossain</w:t>
-              </w:r>
-              <w:proofErr w:type="spellEnd"/>
-              <w:r>
-                <w:rPr>
-                  <w:lang w:val="pt-BR"/>
-                </w:rPr>
-                <w:t xml:space="preserve">, M. S. </w:t>
+              <w:r>
+                <w:rPr>
+                  <w:lang w:val="pt-BR"/>
+                </w:rPr>
+                <w:t xml:space="preserve">Chouksey, A.; Shovon, M. S. S.; Tannier, N. R.; Bhowmik, P. K.; Hossain, M.; Rahman, M. S.; Rahman, M. K.; Hossain, M. S. </w:t>
               </w:r>
               <w:r>
                 <w:rPr>
@@ -1562,232 +1265,22 @@
                   <w:bCs/>
                   <w:lang w:val="pt-BR"/>
                 </w:rPr>
-                <w:t>Machine learning-</w:t>
-              </w:r>
-              <w:proofErr w:type="spellStart"/>
-              <w:r>
-                <w:rPr>
-                  <w:b/>
-                  <w:bCs/>
-                  <w:lang w:val="pt-BR"/>
-                </w:rPr>
-                <w:t>based</w:t>
-              </w:r>
-              <w:proofErr w:type="spellEnd"/>
-              <w:r>
-                <w:rPr>
-                  <w:b/>
-                  <w:bCs/>
-                  <w:lang w:val="pt-BR"/>
-                </w:rPr>
-                <w:t xml:space="preserve"> </w:t>
-              </w:r>
-              <w:proofErr w:type="spellStart"/>
-              <w:r>
-                <w:rPr>
-                  <w:b/>
-                  <w:bCs/>
-                  <w:lang w:val="pt-BR"/>
-                </w:rPr>
-                <w:t>risk</w:t>
-              </w:r>
-              <w:proofErr w:type="spellEnd"/>
-              <w:r>
-                <w:rPr>
-                  <w:b/>
-                  <w:bCs/>
-                  <w:lang w:val="pt-BR"/>
-                </w:rPr>
-                <w:t xml:space="preserve"> </w:t>
-              </w:r>
-              <w:proofErr w:type="spellStart"/>
-              <w:r>
-                <w:rPr>
-                  <w:b/>
-                  <w:bCs/>
-                  <w:lang w:val="pt-BR"/>
-                </w:rPr>
-                <w:t>prediction</w:t>
-              </w:r>
-              <w:proofErr w:type="spellEnd"/>
-              <w:r>
-                <w:rPr>
-                  <w:b/>
-                  <w:bCs/>
-                  <w:lang w:val="pt-BR"/>
-                </w:rPr>
-                <w:t xml:space="preserve"> model for </w:t>
-              </w:r>
-              <w:proofErr w:type="spellStart"/>
-              <w:r>
-                <w:rPr>
-                  <w:b/>
-                  <w:bCs/>
-                  <w:lang w:val="pt-BR"/>
-                </w:rPr>
-                <w:t>loan</w:t>
-              </w:r>
-              <w:proofErr w:type="spellEnd"/>
-              <w:r>
-                <w:rPr>
-                  <w:b/>
-                  <w:bCs/>
-                  <w:lang w:val="pt-BR"/>
-                </w:rPr>
-                <w:t xml:space="preserve"> </w:t>
-              </w:r>
-              <w:proofErr w:type="spellStart"/>
-              <w:r>
-                <w:rPr>
-                  <w:b/>
-                  <w:bCs/>
-                  <w:lang w:val="pt-BR"/>
-                </w:rPr>
-                <w:t>applications</w:t>
-              </w:r>
-              <w:proofErr w:type="spellEnd"/>
-              <w:r>
-                <w:rPr>
-                  <w:b/>
-                  <w:bCs/>
-                  <w:lang w:val="pt-BR"/>
-                </w:rPr>
-                <w:t xml:space="preserve">: </w:t>
-              </w:r>
-              <w:proofErr w:type="spellStart"/>
-              <w:r>
-                <w:rPr>
-                  <w:b/>
-                  <w:bCs/>
-                  <w:lang w:val="pt-BR"/>
-                </w:rPr>
-                <w:t>enhancing</w:t>
-              </w:r>
-              <w:proofErr w:type="spellEnd"/>
-              <w:r>
-                <w:rPr>
-                  <w:b/>
-                  <w:bCs/>
-                  <w:lang w:val="pt-BR"/>
-                </w:rPr>
-                <w:t xml:space="preserve"> </w:t>
-              </w:r>
-              <w:proofErr w:type="spellStart"/>
-              <w:r>
-                <w:rPr>
-                  <w:b/>
-                  <w:bCs/>
-                  <w:lang w:val="pt-BR"/>
-                </w:rPr>
-                <w:t>decision</w:t>
-              </w:r>
-              <w:proofErr w:type="spellEnd"/>
-              <w:r>
-                <w:rPr>
-                  <w:b/>
-                  <w:bCs/>
-                  <w:lang w:val="pt-BR"/>
-                </w:rPr>
-                <w:t xml:space="preserve">-making </w:t>
-              </w:r>
-              <w:proofErr w:type="spellStart"/>
-              <w:r>
-                <w:rPr>
-                  <w:b/>
-                  <w:bCs/>
-                  <w:lang w:val="pt-BR"/>
-                </w:rPr>
-                <w:t>and</w:t>
-              </w:r>
-              <w:proofErr w:type="spellEnd"/>
-              <w:r>
-                <w:rPr>
-                  <w:b/>
-                  <w:bCs/>
-                  <w:lang w:val="pt-BR"/>
-                </w:rPr>
-                <w:t xml:space="preserve"> default </w:t>
-              </w:r>
-              <w:proofErr w:type="spellStart"/>
-              <w:r>
-                <w:rPr>
-                  <w:b/>
-                  <w:bCs/>
-                  <w:lang w:val="pt-BR"/>
-                </w:rPr>
-                <w:t>prevention</w:t>
-              </w:r>
-              <w:proofErr w:type="spellEnd"/>
+                <w:t>Machine learning-based risk prediction model for loan applications: enhancing decision-making and default prevention</w:t>
+              </w:r>
               <w:r>
                 <w:rPr>
                   <w:lang w:val="pt-BR"/>
                 </w:rPr>
                 <w:t xml:space="preserve">. </w:t>
               </w:r>
-              <w:proofErr w:type="spellStart"/>
               <w:r>
                 <w:rPr>
                   <w:i/>
                   <w:iCs/>
                   <w:lang w:val="pt-BR"/>
                 </w:rPr>
-                <w:t>Journal</w:t>
-              </w:r>
-              <w:proofErr w:type="spellEnd"/>
-              <w:r>
-                <w:rPr>
-                  <w:i/>
-                  <w:iCs/>
-                  <w:lang w:val="pt-BR"/>
-                </w:rPr>
-                <w:t xml:space="preserve"> </w:t>
-              </w:r>
-              <w:proofErr w:type="spellStart"/>
-              <w:r>
-                <w:rPr>
-                  <w:i/>
-                  <w:iCs/>
-                  <w:lang w:val="pt-BR"/>
-                </w:rPr>
-                <w:t>of</w:t>
-              </w:r>
-              <w:proofErr w:type="spellEnd"/>
-              <w:r>
-                <w:rPr>
-                  <w:i/>
-                  <w:iCs/>
-                  <w:lang w:val="pt-BR"/>
-                </w:rPr>
-                <w:t xml:space="preserve"> Business </w:t>
-              </w:r>
-              <w:proofErr w:type="spellStart"/>
-              <w:r>
-                <w:rPr>
-                  <w:i/>
-                  <w:iCs/>
-                  <w:lang w:val="pt-BR"/>
-                </w:rPr>
-                <w:t>and</w:t>
-              </w:r>
-              <w:proofErr w:type="spellEnd"/>
-              <w:r>
-                <w:rPr>
-                  <w:i/>
-                  <w:iCs/>
-                  <w:lang w:val="pt-BR"/>
-                </w:rPr>
-                <w:t xml:space="preserve"> Management </w:t>
-              </w:r>
-              <w:proofErr w:type="spellStart"/>
-              <w:r>
-                <w:rPr>
-                  <w:i/>
-                  <w:iCs/>
-                  <w:lang w:val="pt-BR"/>
-                </w:rPr>
-                <w:t>Studies</w:t>
-              </w:r>
-              <w:proofErr w:type="spellEnd"/>
+                <w:t>Journal of Business and Management Studies</w:t>
+              </w:r>
               <w:r>
                 <w:rPr>
                   <w:lang w:val="pt-BR"/>
@@ -1807,194 +1300,28 @@
                 </w:rPr>
                 <w:t xml:space="preserve">Gupta, S. </w:t>
               </w:r>
-              <w:proofErr w:type="spellStart"/>
               <w:r>
                 <w:rPr>
                   <w:b/>
                   <w:bCs/>
                   <w:lang w:val="pt-BR"/>
                 </w:rPr>
-                <w:t>Impact</w:t>
-              </w:r>
-              <w:proofErr w:type="spellEnd"/>
-              <w:r>
-                <w:rPr>
-                  <w:b/>
-                  <w:bCs/>
-                  <w:lang w:val="pt-BR"/>
-                </w:rPr>
-                <w:t xml:space="preserve"> </w:t>
-              </w:r>
-              <w:proofErr w:type="spellStart"/>
-              <w:r>
-                <w:rPr>
-                  <w:b/>
-                  <w:bCs/>
-                  <w:lang w:val="pt-BR"/>
-                </w:rPr>
-                <w:t>of</w:t>
-              </w:r>
-              <w:proofErr w:type="spellEnd"/>
-              <w:r>
-                <w:rPr>
-                  <w:b/>
-                  <w:bCs/>
-                  <w:lang w:val="pt-BR"/>
-                </w:rPr>
-                <w:t xml:space="preserve"> artificial </w:t>
-              </w:r>
-              <w:proofErr w:type="spellStart"/>
-              <w:r>
-                <w:rPr>
-                  <w:b/>
-                  <w:bCs/>
-                  <w:lang w:val="pt-BR"/>
-                </w:rPr>
-                <w:t>intelligence</w:t>
-              </w:r>
-              <w:proofErr w:type="spellEnd"/>
-              <w:r>
-                <w:rPr>
-                  <w:b/>
-                  <w:bCs/>
-                  <w:lang w:val="pt-BR"/>
-                </w:rPr>
-                <w:t xml:space="preserve"> </w:t>
-              </w:r>
-              <w:proofErr w:type="spellStart"/>
-              <w:r>
-                <w:rPr>
-                  <w:b/>
-                  <w:bCs/>
-                  <w:lang w:val="pt-BR"/>
-                </w:rPr>
-                <w:t>on</w:t>
-              </w:r>
-              <w:proofErr w:type="spellEnd"/>
-              <w:r>
-                <w:rPr>
-                  <w:b/>
-                  <w:bCs/>
-                  <w:lang w:val="pt-BR"/>
-                </w:rPr>
-                <w:t xml:space="preserve"> financial </w:t>
-              </w:r>
-              <w:proofErr w:type="spellStart"/>
-              <w:r>
-                <w:rPr>
-                  <w:b/>
-                  <w:bCs/>
-                  <w:lang w:val="pt-BR"/>
-                </w:rPr>
-                <w:t>decision</w:t>
-              </w:r>
-              <w:proofErr w:type="spellEnd"/>
-              <w:r>
-                <w:rPr>
-                  <w:b/>
-                  <w:bCs/>
-                  <w:lang w:val="pt-BR"/>
-                </w:rPr>
-                <w:t xml:space="preserve"> making: a </w:t>
-              </w:r>
-              <w:proofErr w:type="spellStart"/>
-              <w:r>
-                <w:rPr>
-                  <w:b/>
-                  <w:bCs/>
-                  <w:lang w:val="pt-BR"/>
-                </w:rPr>
-                <w:t>qualitative</w:t>
-              </w:r>
-              <w:proofErr w:type="spellEnd"/>
-              <w:r>
-                <w:rPr>
-                  <w:b/>
-                  <w:bCs/>
-                  <w:lang w:val="pt-BR"/>
-                </w:rPr>
-                <w:t xml:space="preserve"> </w:t>
-              </w:r>
-              <w:proofErr w:type="spellStart"/>
-              <w:r>
-                <w:rPr>
-                  <w:b/>
-                  <w:bCs/>
-                  <w:lang w:val="pt-BR"/>
-                </w:rPr>
-                <w:t>study</w:t>
-              </w:r>
-              <w:proofErr w:type="spellEnd"/>
+                <w:t>Impact of artificial intelligence on financial decision making: a qualitative study</w:t>
+              </w:r>
               <w:r>
                 <w:rPr>
                   <w:lang w:val="pt-BR"/>
                 </w:rPr>
                 <w:t xml:space="preserve">. </w:t>
               </w:r>
-              <w:proofErr w:type="spellStart"/>
               <w:r>
                 <w:rPr>
                   <w:i/>
                   <w:iCs/>
                   <w:lang w:val="pt-BR"/>
                 </w:rPr>
-                <w:t>Journal</w:t>
-              </w:r>
-              <w:proofErr w:type="spellEnd"/>
-              <w:r>
-                <w:rPr>
-                  <w:i/>
-                  <w:iCs/>
-                  <w:lang w:val="pt-BR"/>
-                </w:rPr>
-                <w:t xml:space="preserve"> </w:t>
-              </w:r>
-              <w:proofErr w:type="spellStart"/>
-              <w:r>
-                <w:rPr>
-                  <w:i/>
-                  <w:iCs/>
-                  <w:lang w:val="pt-BR"/>
-                </w:rPr>
-                <w:t>of</w:t>
-              </w:r>
-              <w:proofErr w:type="spellEnd"/>
-              <w:r>
-                <w:rPr>
-                  <w:i/>
-                  <w:iCs/>
-                  <w:lang w:val="pt-BR"/>
-                </w:rPr>
-                <w:t xml:space="preserve"> Cardiovascular </w:t>
-              </w:r>
-              <w:proofErr w:type="spellStart"/>
-              <w:r>
-                <w:rPr>
-                  <w:i/>
-                  <w:iCs/>
-                  <w:lang w:val="pt-BR"/>
-                </w:rPr>
-                <w:t>Disease</w:t>
-              </w:r>
-              <w:proofErr w:type="spellEnd"/>
-              <w:r>
-                <w:rPr>
-                  <w:i/>
-                  <w:iCs/>
-                  <w:lang w:val="pt-BR"/>
-                </w:rPr>
-                <w:t xml:space="preserve"> </w:t>
-              </w:r>
-              <w:proofErr w:type="spellStart"/>
-              <w:r>
-                <w:rPr>
-                  <w:i/>
-                  <w:iCs/>
-                  <w:lang w:val="pt-BR"/>
-                </w:rPr>
-                <w:t>Research</w:t>
-              </w:r>
-              <w:proofErr w:type="spellEnd"/>
+                <w:t>Journal of Cardiovascular Disease Research</w:t>
+              </w:r>
               <w:r>
                 <w:rPr>
                   <w:lang w:val="pt-BR"/>
@@ -2008,19 +1335,11 @@
                   <w:lang w:val="pt-BR"/>
                 </w:rPr>
               </w:pPr>
-              <w:proofErr w:type="spellStart"/>
-              <w:r>
-                <w:rPr>
-                  <w:lang w:val="pt-BR"/>
-                </w:rPr>
-                <w:t>Hsu</w:t>
-              </w:r>
-              <w:proofErr w:type="spellEnd"/>
-              <w:r>
-                <w:rPr>
-                  <w:lang w:val="pt-BR"/>
-                </w:rPr>
-                <w:t xml:space="preserve">, T. C.; Liou, S. T.; Wang, Y. P.; Huang, Y. S. </w:t>
+              <w:r>
+                <w:rPr>
+                  <w:lang w:val="pt-BR"/>
+                </w:rPr>
+                <w:t xml:space="preserve">Hsu, T. C.; Liou, S. T.; Wang, Y. P.; Huang, Y. S. </w:t>
               </w:r>
               <w:r>
                 <w:rPr>
@@ -2028,126 +1347,8 @@
                   <w:bCs/>
                   <w:lang w:val="pt-BR"/>
                 </w:rPr>
-                <w:t xml:space="preserve">Enhanced </w:t>
-              </w:r>
-              <w:proofErr w:type="spellStart"/>
-              <w:r>
-                <w:rPr>
-                  <w:b/>
-                  <w:bCs/>
-                  <w:lang w:val="pt-BR"/>
-                </w:rPr>
-                <w:t>recurrent</w:t>
-              </w:r>
-              <w:proofErr w:type="spellEnd"/>
-              <w:r>
-                <w:rPr>
-                  <w:b/>
-                  <w:bCs/>
-                  <w:lang w:val="pt-BR"/>
-                </w:rPr>
-                <w:t xml:space="preserve"> neural network for </w:t>
-              </w:r>
-              <w:proofErr w:type="spellStart"/>
-              <w:r>
-                <w:rPr>
-                  <w:b/>
-                  <w:bCs/>
-                  <w:lang w:val="pt-BR"/>
-                </w:rPr>
-                <w:t>combining</w:t>
-              </w:r>
-              <w:proofErr w:type="spellEnd"/>
-              <w:r>
-                <w:rPr>
-                  <w:b/>
-                  <w:bCs/>
-                  <w:lang w:val="pt-BR"/>
-                </w:rPr>
-                <w:t xml:space="preserve"> </w:t>
-              </w:r>
-              <w:proofErr w:type="spellStart"/>
-              <w:r>
-                <w:rPr>
-                  <w:b/>
-                  <w:bCs/>
-                  <w:lang w:val="pt-BR"/>
-                </w:rPr>
-                <w:t>static</w:t>
-              </w:r>
-              <w:proofErr w:type="spellEnd"/>
-              <w:r>
-                <w:rPr>
-                  <w:b/>
-                  <w:bCs/>
-                  <w:lang w:val="pt-BR"/>
-                </w:rPr>
-                <w:t xml:space="preserve"> </w:t>
-              </w:r>
-              <w:proofErr w:type="spellStart"/>
-              <w:r>
-                <w:rPr>
-                  <w:b/>
-                  <w:bCs/>
-                  <w:lang w:val="pt-BR"/>
-                </w:rPr>
-                <w:t>and</w:t>
-              </w:r>
-              <w:proofErr w:type="spellEnd"/>
-              <w:r>
-                <w:rPr>
-                  <w:b/>
-                  <w:bCs/>
-                  <w:lang w:val="pt-BR"/>
-                </w:rPr>
-                <w:t xml:space="preserve"> </w:t>
-              </w:r>
-              <w:proofErr w:type="spellStart"/>
-              <w:r>
-                <w:rPr>
-                  <w:b/>
-                  <w:bCs/>
-                  <w:lang w:val="pt-BR"/>
-                </w:rPr>
-                <w:t>dynamic</w:t>
-              </w:r>
-              <w:proofErr w:type="spellEnd"/>
-              <w:r>
-                <w:rPr>
-                  <w:b/>
-                  <w:bCs/>
-                  <w:lang w:val="pt-BR"/>
-                </w:rPr>
-                <w:t xml:space="preserve"> features for </w:t>
-              </w:r>
-              <w:proofErr w:type="spellStart"/>
-              <w:r>
-                <w:rPr>
-                  <w:b/>
-                  <w:bCs/>
-                  <w:lang w:val="pt-BR"/>
-                </w:rPr>
-                <w:t>credit</w:t>
-              </w:r>
-              <w:proofErr w:type="spellEnd"/>
-              <w:r>
-                <w:rPr>
-                  <w:b/>
-                  <w:bCs/>
-                  <w:lang w:val="pt-BR"/>
-                </w:rPr>
-                <w:t xml:space="preserve"> card default </w:t>
-              </w:r>
-              <w:proofErr w:type="spellStart"/>
-              <w:r>
-                <w:rPr>
-                  <w:b/>
-                  <w:bCs/>
-                  <w:lang w:val="pt-BR"/>
-                </w:rPr>
-                <w:t>prediction</w:t>
-              </w:r>
-              <w:proofErr w:type="spellEnd"/>
+                <w:t>Enhanced recurrent neural network for combining static and dynamic features for credit card default prediction</w:t>
+              </w:r>
               <w:r>
                 <w:rPr>
                   <w:lang w:val="pt-BR"/>
@@ -2160,145 +1361,13 @@
                   <w:iCs/>
                   <w:lang w:val="pt-BR"/>
                 </w:rPr>
-                <w:t xml:space="preserve">ICASSP 2019 – IEEE </w:t>
-              </w:r>
-              <w:proofErr w:type="spellStart"/>
-              <w:r>
-                <w:rPr>
-                  <w:i/>
-                  <w:iCs/>
-                  <w:lang w:val="pt-BR"/>
-                </w:rPr>
-                <w:t>International</w:t>
-              </w:r>
-              <w:proofErr w:type="spellEnd"/>
-              <w:r>
-                <w:rPr>
-                  <w:i/>
-                  <w:iCs/>
-                  <w:lang w:val="pt-BR"/>
-                </w:rPr>
-                <w:t xml:space="preserve"> </w:t>
-              </w:r>
-              <w:proofErr w:type="spellStart"/>
-              <w:r>
-                <w:rPr>
-                  <w:i/>
-                  <w:iCs/>
-                  <w:lang w:val="pt-BR"/>
-                </w:rPr>
-                <w:t>Conference</w:t>
-              </w:r>
-              <w:proofErr w:type="spellEnd"/>
-              <w:r>
-                <w:rPr>
-                  <w:i/>
-                  <w:iCs/>
-                  <w:lang w:val="pt-BR"/>
-                </w:rPr>
-                <w:t xml:space="preserve"> </w:t>
-              </w:r>
-              <w:proofErr w:type="spellStart"/>
-              <w:r>
-                <w:rPr>
-                  <w:i/>
-                  <w:iCs/>
-                  <w:lang w:val="pt-BR"/>
-                </w:rPr>
-                <w:t>on</w:t>
-              </w:r>
-              <w:proofErr w:type="spellEnd"/>
-              <w:r>
-                <w:rPr>
-                  <w:i/>
-                  <w:iCs/>
-                  <w:lang w:val="pt-BR"/>
-                </w:rPr>
-                <w:t xml:space="preserve"> </w:t>
-              </w:r>
-              <w:proofErr w:type="spellStart"/>
-              <w:r>
-                <w:rPr>
-                  <w:i/>
-                  <w:iCs/>
-                  <w:lang w:val="pt-BR"/>
-                </w:rPr>
-                <w:t>Acoustics</w:t>
-              </w:r>
-              <w:proofErr w:type="spellEnd"/>
-              <w:r>
-                <w:rPr>
-                  <w:i/>
-                  <w:iCs/>
-                  <w:lang w:val="pt-BR"/>
-                </w:rPr>
-                <w:t xml:space="preserve">, Speech </w:t>
-              </w:r>
-              <w:proofErr w:type="spellStart"/>
-              <w:r>
-                <w:rPr>
-                  <w:i/>
-                  <w:iCs/>
-                  <w:lang w:val="pt-BR"/>
-                </w:rPr>
-                <w:t>and</w:t>
-              </w:r>
-              <w:proofErr w:type="spellEnd"/>
-              <w:r>
-                <w:rPr>
-                  <w:i/>
-                  <w:iCs/>
-                  <w:lang w:val="pt-BR"/>
-                </w:rPr>
-                <w:t xml:space="preserve"> </w:t>
-              </w:r>
-              <w:proofErr w:type="spellStart"/>
-              <w:r>
-                <w:rPr>
-                  <w:i/>
-                  <w:iCs/>
-                  <w:lang w:val="pt-BR"/>
-                </w:rPr>
-                <w:t>Signal</w:t>
-              </w:r>
-              <w:proofErr w:type="spellEnd"/>
-              <w:r>
-                <w:rPr>
-                  <w:i/>
-                  <w:iCs/>
-                  <w:lang w:val="pt-BR"/>
-                </w:rPr>
-                <w:t xml:space="preserve"> </w:t>
-              </w:r>
-              <w:proofErr w:type="spellStart"/>
-              <w:r>
-                <w:rPr>
-                  <w:i/>
-                  <w:iCs/>
-                  <w:lang w:val="pt-BR"/>
-                </w:rPr>
-                <w:t>Processing</w:t>
-              </w:r>
-              <w:proofErr w:type="spellEnd"/>
-              <w:r>
-                <w:rPr>
-                  <w:lang w:val="pt-BR"/>
-                </w:rPr>
-                <w:t xml:space="preserve">. </w:t>
-              </w:r>
-              <w:proofErr w:type="spellStart"/>
-              <w:r>
-                <w:rPr>
-                  <w:lang w:val="pt-BR"/>
-                </w:rPr>
-                <w:t>Proceedings</w:t>
-              </w:r>
-              <w:proofErr w:type="spellEnd"/>
-              <w:r>
-                <w:rPr>
-                  <w:lang w:val="pt-BR"/>
-                </w:rPr>
-                <w:t xml:space="preserve"> [...]. IEEE, 2019. p. 1572–1576.</w:t>
+                <w:t>ICASSP 2019 – IEEE International Conference on Acoustics, Speech and Signal Processing</w:t>
+              </w:r>
+              <w:r>
+                <w:rPr>
+                  <w:lang w:val="pt-BR"/>
+                </w:rPr>
+                <w:t>. Proceedings [...]. IEEE, 2019. p. 1572–1576.</w:t>
               </w:r>
             </w:p>
             <w:p>
@@ -2320,61 +1389,7 @@
                   <w:bCs/>
                   <w:lang w:val="pt-BR"/>
                 </w:rPr>
-                <w:t>AI-</w:t>
-              </w:r>
-              <w:proofErr w:type="spellStart"/>
-              <w:r>
-                <w:rPr>
-                  <w:b/>
-                  <w:bCs/>
-                  <w:lang w:val="pt-BR"/>
-                </w:rPr>
-                <w:t>powered</w:t>
-              </w:r>
-              <w:proofErr w:type="spellEnd"/>
-              <w:r>
-                <w:rPr>
-                  <w:b/>
-                  <w:bCs/>
-                  <w:lang w:val="pt-BR"/>
-                </w:rPr>
-                <w:t xml:space="preserve"> tools for </w:t>
-              </w:r>
-              <w:proofErr w:type="spellStart"/>
-              <w:r>
-                <w:rPr>
-                  <w:b/>
-                  <w:bCs/>
-                  <w:lang w:val="pt-BR"/>
-                </w:rPr>
-                <w:t>automated</w:t>
-              </w:r>
-              <w:proofErr w:type="spellEnd"/>
-              <w:r>
-                <w:rPr>
-                  <w:b/>
-                  <w:bCs/>
-                  <w:lang w:val="pt-BR"/>
-                </w:rPr>
-                <w:t xml:space="preserve"> financial </w:t>
-              </w:r>
-              <w:proofErr w:type="spellStart"/>
-              <w:r>
-                <w:rPr>
-                  <w:b/>
-                  <w:bCs/>
-                  <w:lang w:val="pt-BR"/>
-                </w:rPr>
-                <w:t>decision</w:t>
-              </w:r>
-              <w:proofErr w:type="spellEnd"/>
-              <w:r>
-                <w:rPr>
-                  <w:b/>
-                  <w:bCs/>
-                  <w:lang w:val="pt-BR"/>
-                </w:rPr>
-                <w:t>-making</w:t>
+                <w:t>AI-powered tools for automated financial decision-making</w:t>
               </w:r>
               <w:r>
                 <w:rPr>
@@ -2389,163 +1404,19 @@
                   <w:lang w:val="pt-BR"/>
                 </w:rPr>
               </w:pPr>
-              <w:proofErr w:type="spellStart"/>
-              <w:r>
-                <w:rPr>
-                  <w:lang w:val="pt-BR"/>
-                </w:rPr>
-                <w:t>Jillson</w:t>
-              </w:r>
-              <w:proofErr w:type="spellEnd"/>
-              <w:r>
-                <w:rPr>
-                  <w:lang w:val="pt-BR"/>
-                </w:rPr>
-                <w:t xml:space="preserve">, E. </w:t>
-              </w:r>
-              <w:proofErr w:type="spellStart"/>
+              <w:r>
+                <w:rPr>
+                  <w:lang w:val="pt-BR"/>
+                </w:rPr>
+                <w:t xml:space="preserve">Jillson, E. </w:t>
+              </w:r>
               <w:r>
                 <w:rPr>
                   <w:b/>
                   <w:bCs/>
                   <w:lang w:val="pt-BR"/>
                 </w:rPr>
-                <w:t>Aiming</w:t>
-              </w:r>
-              <w:proofErr w:type="spellEnd"/>
-              <w:r>
-                <w:rPr>
-                  <w:b/>
-                  <w:bCs/>
-                  <w:lang w:val="pt-BR"/>
-                </w:rPr>
-                <w:t xml:space="preserve"> for </w:t>
-              </w:r>
-              <w:proofErr w:type="spellStart"/>
-              <w:r>
-                <w:rPr>
-                  <w:b/>
-                  <w:bCs/>
-                  <w:lang w:val="pt-BR"/>
-                </w:rPr>
-                <w:t>truth</w:t>
-              </w:r>
-              <w:proofErr w:type="spellEnd"/>
-              <w:r>
-                <w:rPr>
-                  <w:b/>
-                  <w:bCs/>
-                  <w:lang w:val="pt-BR"/>
-                </w:rPr>
-                <w:t xml:space="preserve">, </w:t>
-              </w:r>
-              <w:proofErr w:type="spellStart"/>
-              <w:r>
-                <w:rPr>
-                  <w:b/>
-                  <w:bCs/>
-                  <w:lang w:val="pt-BR"/>
-                </w:rPr>
-                <w:t>fairness</w:t>
-              </w:r>
-              <w:proofErr w:type="spellEnd"/>
-              <w:r>
-                <w:rPr>
-                  <w:b/>
-                  <w:bCs/>
-                  <w:lang w:val="pt-BR"/>
-                </w:rPr>
-                <w:t xml:space="preserve">, </w:t>
-              </w:r>
-              <w:proofErr w:type="spellStart"/>
-              <w:r>
-                <w:rPr>
-                  <w:b/>
-                  <w:bCs/>
-                  <w:lang w:val="pt-BR"/>
-                </w:rPr>
-                <w:t>and</w:t>
-              </w:r>
-              <w:proofErr w:type="spellEnd"/>
-              <w:r>
-                <w:rPr>
-                  <w:b/>
-                  <w:bCs/>
-                  <w:lang w:val="pt-BR"/>
-                </w:rPr>
-                <w:t xml:space="preserve"> </w:t>
-              </w:r>
-              <w:proofErr w:type="spellStart"/>
-              <w:r>
-                <w:rPr>
-                  <w:b/>
-                  <w:bCs/>
-                  <w:lang w:val="pt-BR"/>
-                </w:rPr>
-                <w:t>equity</w:t>
-              </w:r>
-              <w:proofErr w:type="spellEnd"/>
-              <w:r>
-                <w:rPr>
-                  <w:b/>
-                  <w:bCs/>
-                  <w:lang w:val="pt-BR"/>
-                </w:rPr>
-                <w:t xml:space="preserve"> in </w:t>
-              </w:r>
-              <w:proofErr w:type="spellStart"/>
-              <w:r>
-                <w:rPr>
-                  <w:b/>
-                  <w:bCs/>
-                  <w:lang w:val="pt-BR"/>
-                </w:rPr>
-                <w:t>your</w:t>
-              </w:r>
-              <w:proofErr w:type="spellEnd"/>
-              <w:r>
-                <w:rPr>
-                  <w:b/>
-                  <w:bCs/>
-                  <w:lang w:val="pt-BR"/>
-                </w:rPr>
-                <w:t xml:space="preserve"> </w:t>
-              </w:r>
-              <w:proofErr w:type="spellStart"/>
-              <w:r>
-                <w:rPr>
-                  <w:b/>
-                  <w:bCs/>
-                  <w:lang w:val="pt-BR"/>
-                </w:rPr>
-                <w:t>company’s</w:t>
-              </w:r>
-              <w:proofErr w:type="spellEnd"/>
-              <w:r>
-                <w:rPr>
-                  <w:b/>
-                  <w:bCs/>
-                  <w:lang w:val="pt-BR"/>
-                </w:rPr>
-                <w:t xml:space="preserve"> use </w:t>
-              </w:r>
-              <w:proofErr w:type="spellStart"/>
-              <w:r>
-                <w:rPr>
-                  <w:b/>
-                  <w:bCs/>
-                  <w:lang w:val="pt-BR"/>
-                </w:rPr>
-                <w:t>of</w:t>
-              </w:r>
-              <w:proofErr w:type="spellEnd"/>
-              <w:r>
-                <w:rPr>
-                  <w:b/>
-                  <w:bCs/>
-                  <w:lang w:val="pt-BR"/>
-                </w:rPr>
-                <w:t xml:space="preserve"> AI</w:t>
+                <w:t>Aiming for truth, fairness, and equity in your company’s use of AI</w:t>
               </w:r>
               <w:r>
                 <w:rPr>
@@ -2572,153 +1443,13 @@
                   <w:bCs/>
                   <w:lang w:val="pt-BR"/>
                 </w:rPr>
-                <w:t xml:space="preserve">Machine learning model for </w:t>
-              </w:r>
-              <w:proofErr w:type="spellStart"/>
-              <w:r>
-                <w:rPr>
-                  <w:b/>
-                  <w:bCs/>
-                  <w:lang w:val="pt-BR"/>
-                </w:rPr>
-                <w:t>heart</w:t>
-              </w:r>
-              <w:proofErr w:type="spellEnd"/>
-              <w:r>
-                <w:rPr>
-                  <w:b/>
-                  <w:bCs/>
-                  <w:lang w:val="pt-BR"/>
-                </w:rPr>
-                <w:t xml:space="preserve"> </w:t>
-              </w:r>
-              <w:proofErr w:type="spellStart"/>
-              <w:r>
-                <w:rPr>
-                  <w:b/>
-                  <w:bCs/>
-                  <w:lang w:val="pt-BR"/>
-                </w:rPr>
-                <w:t>disease</w:t>
-              </w:r>
-              <w:proofErr w:type="spellEnd"/>
-              <w:r>
-                <w:rPr>
-                  <w:b/>
-                  <w:bCs/>
-                  <w:lang w:val="pt-BR"/>
-                </w:rPr>
-                <w:t xml:space="preserve"> </w:t>
-              </w:r>
-              <w:proofErr w:type="spellStart"/>
-              <w:r>
-                <w:rPr>
-                  <w:b/>
-                  <w:bCs/>
-                  <w:lang w:val="pt-BR"/>
-                </w:rPr>
-                <w:t>prediction</w:t>
-              </w:r>
-              <w:proofErr w:type="spellEnd"/>
-              <w:r>
-                <w:rPr>
-                  <w:b/>
-                  <w:bCs/>
-                  <w:lang w:val="pt-BR"/>
-                </w:rPr>
-                <w:t xml:space="preserve"> </w:t>
-              </w:r>
-              <w:proofErr w:type="spellStart"/>
-              <w:r>
-                <w:rPr>
-                  <w:b/>
-                  <w:bCs/>
-                  <w:lang w:val="pt-BR"/>
-                </w:rPr>
-                <w:t>using</w:t>
-              </w:r>
-              <w:proofErr w:type="spellEnd"/>
-              <w:r>
-                <w:rPr>
-                  <w:b/>
-                  <w:bCs/>
-                  <w:lang w:val="pt-BR"/>
-                </w:rPr>
-                <w:t xml:space="preserve"> </w:t>
-              </w:r>
-              <w:proofErr w:type="spellStart"/>
-              <w:r>
-                <w:rPr>
-                  <w:b/>
-                  <w:bCs/>
-                  <w:lang w:val="pt-BR"/>
-                </w:rPr>
-                <w:t>Tkinter</w:t>
-              </w:r>
-              <w:proofErr w:type="spellEnd"/>
-              <w:r>
-                <w:rPr>
-                  <w:b/>
-                  <w:bCs/>
-                  <w:lang w:val="pt-BR"/>
-                </w:rPr>
-                <w:t xml:space="preserve"> for </w:t>
-              </w:r>
-              <w:proofErr w:type="spellStart"/>
-              <w:r>
-                <w:rPr>
-                  <w:b/>
-                  <w:bCs/>
-                  <w:lang w:val="pt-BR"/>
-                </w:rPr>
-                <w:t>graphic</w:t>
-              </w:r>
-              <w:proofErr w:type="spellEnd"/>
-              <w:r>
-                <w:rPr>
-                  <w:b/>
-                  <w:bCs/>
-                  <w:lang w:val="pt-BR"/>
-                </w:rPr>
-                <w:t xml:space="preserve"> </w:t>
-              </w:r>
-              <w:proofErr w:type="spellStart"/>
-              <w:r>
-                <w:rPr>
-                  <w:b/>
-                  <w:bCs/>
-                  <w:lang w:val="pt-BR"/>
-                </w:rPr>
-                <w:t>user</w:t>
-              </w:r>
-              <w:proofErr w:type="spellEnd"/>
-              <w:r>
-                <w:rPr>
-                  <w:b/>
-                  <w:bCs/>
-                  <w:lang w:val="pt-BR"/>
-                </w:rPr>
-                <w:t xml:space="preserve"> interface</w:t>
-              </w:r>
-              <w:r>
-                <w:rPr>
-                  <w:lang w:val="pt-BR"/>
-                </w:rPr>
-                <w:t>. [</w:t>
-              </w:r>
-              <w:proofErr w:type="spellStart"/>
-              <w:r>
-                <w:rPr>
-                  <w:lang w:val="pt-BR"/>
-                </w:rPr>
-                <w:t>S.l</w:t>
-              </w:r>
-              <w:proofErr w:type="spellEnd"/>
-              <w:r>
-                <w:rPr>
-                  <w:lang w:val="pt-BR"/>
-                </w:rPr>
-                <w:t>.: s.n.], 2022.</w:t>
+                <w:t>Machine learning model for heart disease prediction using Tkinter for graphic user interface</w:t>
+              </w:r>
+              <w:r>
+                <w:rPr>
+                  <w:lang w:val="pt-BR"/>
+                </w:rPr>
+                <w:t>. [S.l.: s.n.], 2022.</w:t>
               </w:r>
             </w:p>
             <w:p>
@@ -2727,98 +1458,20 @@
                   <w:lang w:val="pt-BR"/>
                 </w:rPr>
               </w:pPr>
-              <w:proofErr w:type="spellStart"/>
-              <w:r>
-                <w:rPr>
-                  <w:lang w:val="pt-BR"/>
-                </w:rPr>
-                <w:t>Piskunov</w:t>
-              </w:r>
-              <w:proofErr w:type="spellEnd"/>
-              <w:r>
-                <w:rPr>
-                  <w:lang w:val="pt-BR"/>
-                </w:rPr>
-                <w:t xml:space="preserve">, R.; </w:t>
-              </w:r>
-              <w:proofErr w:type="spellStart"/>
-              <w:r>
-                <w:rPr>
-                  <w:lang w:val="pt-BR"/>
-                </w:rPr>
-                <w:t>Moskalenko</w:t>
-              </w:r>
-              <w:proofErr w:type="spellEnd"/>
-              <w:r>
-                <w:rPr>
-                  <w:lang w:val="pt-BR"/>
-                </w:rPr>
-                <w:t xml:space="preserve">, O.; Krill, V. </w:t>
-              </w:r>
-              <w:proofErr w:type="spellStart"/>
+              <w:r>
+                <w:rPr>
+                  <w:lang w:val="pt-BR"/>
+                </w:rPr>
+                <w:t xml:space="preserve">Piskunov, R.; Moskalenko, O.; Krill, V. </w:t>
+              </w:r>
               <w:r>
                 <w:rPr>
                   <w:b/>
                   <w:bCs/>
                   <w:lang w:val="pt-BR"/>
                 </w:rPr>
-                <w:t>Analytical</w:t>
-              </w:r>
-              <w:proofErr w:type="spellEnd"/>
-              <w:r>
-                <w:rPr>
-                  <w:b/>
-                  <w:bCs/>
-                  <w:lang w:val="pt-BR"/>
-                </w:rPr>
-                <w:t xml:space="preserve"> </w:t>
-              </w:r>
-              <w:proofErr w:type="spellStart"/>
-              <w:r>
-                <w:rPr>
-                  <w:b/>
-                  <w:bCs/>
-                  <w:lang w:val="pt-BR"/>
-                </w:rPr>
-                <w:t>support</w:t>
-              </w:r>
-              <w:proofErr w:type="spellEnd"/>
-              <w:r>
-                <w:rPr>
-                  <w:b/>
-                  <w:bCs/>
-                  <w:lang w:val="pt-BR"/>
-                </w:rPr>
-                <w:t xml:space="preserve"> for bank </w:t>
-              </w:r>
-              <w:proofErr w:type="spellStart"/>
-              <w:r>
-                <w:rPr>
-                  <w:b/>
-                  <w:bCs/>
-                  <w:lang w:val="pt-BR"/>
-                </w:rPr>
-                <w:t>loan</w:t>
-              </w:r>
-              <w:proofErr w:type="spellEnd"/>
-              <w:r>
-                <w:rPr>
-                  <w:b/>
-                  <w:bCs/>
-                  <w:lang w:val="pt-BR"/>
-                </w:rPr>
-                <w:t xml:space="preserve"> </w:t>
-              </w:r>
-              <w:proofErr w:type="spellStart"/>
-              <w:r>
-                <w:rPr>
-                  <w:b/>
-                  <w:bCs/>
-                  <w:lang w:val="pt-BR"/>
-                </w:rPr>
-                <w:t>transactions</w:t>
-              </w:r>
-              <w:proofErr w:type="spellEnd"/>
+                <w:t>Analytical support for bank loan transactions</w:t>
+              </w:r>
               <w:r>
                 <w:rPr>
                   <w:lang w:val="pt-BR"/>
@@ -2831,54 +1484,8 @@
                   <w:iCs/>
                   <w:lang w:val="pt-BR"/>
                 </w:rPr>
-                <w:t xml:space="preserve">Financial </w:t>
-              </w:r>
-              <w:proofErr w:type="spellStart"/>
-              <w:r>
-                <w:rPr>
-                  <w:i/>
-                  <w:iCs/>
-                  <w:lang w:val="pt-BR"/>
-                </w:rPr>
-                <w:t>and</w:t>
-              </w:r>
-              <w:proofErr w:type="spellEnd"/>
-              <w:r>
-                <w:rPr>
-                  <w:i/>
-                  <w:iCs/>
-                  <w:lang w:val="pt-BR"/>
-                </w:rPr>
-                <w:t xml:space="preserve"> </w:t>
-              </w:r>
-              <w:proofErr w:type="spellStart"/>
-              <w:r>
-                <w:rPr>
-                  <w:i/>
-                  <w:iCs/>
-                  <w:lang w:val="pt-BR"/>
-                </w:rPr>
-                <w:t>Credit</w:t>
-              </w:r>
-              <w:proofErr w:type="spellEnd"/>
-              <w:r>
-                <w:rPr>
-                  <w:i/>
-                  <w:iCs/>
-                  <w:lang w:val="pt-BR"/>
-                </w:rPr>
-                <w:t xml:space="preserve"> Systems: Prospects for </w:t>
-              </w:r>
-              <w:proofErr w:type="spellStart"/>
-              <w:r>
-                <w:rPr>
-                  <w:i/>
-                  <w:iCs/>
-                  <w:lang w:val="pt-BR"/>
-                </w:rPr>
-                <w:t>Development</w:t>
-              </w:r>
-              <w:proofErr w:type="spellEnd"/>
+                <w:t>Financial and Credit Systems: Prospects for Development</w:t>
+              </w:r>
               <w:r>
                 <w:rPr>
                   <w:lang w:val="pt-BR"/>
@@ -2892,89 +1499,11 @@
                   <w:lang w:val="pt-BR"/>
                 </w:rPr>
               </w:pPr>
-              <w:proofErr w:type="spellStart"/>
-              <w:r>
-                <w:rPr>
-                  <w:lang w:val="pt-BR"/>
-                </w:rPr>
-                <w:t>Sizan</w:t>
-              </w:r>
-              <w:proofErr w:type="spellEnd"/>
-              <w:r>
-                <w:rPr>
-                  <w:lang w:val="pt-BR"/>
-                </w:rPr>
-                <w:t xml:space="preserve">, M. M. H.; Das, B. C.; </w:t>
-              </w:r>
-              <w:proofErr w:type="spellStart"/>
-              <w:r>
-                <w:rPr>
-                  <w:lang w:val="pt-BR"/>
-                </w:rPr>
-                <w:t>Shawon</w:t>
-              </w:r>
-              <w:proofErr w:type="spellEnd"/>
-              <w:r>
-                <w:rPr>
-                  <w:lang w:val="pt-BR"/>
-                </w:rPr>
-                <w:t xml:space="preserve">, R. E. R.; </w:t>
-              </w:r>
-              <w:proofErr w:type="spellStart"/>
-              <w:r>
-                <w:rPr>
-                  <w:lang w:val="pt-BR"/>
-                </w:rPr>
-                <w:t>Rana</w:t>
-              </w:r>
-              <w:proofErr w:type="spellEnd"/>
-              <w:r>
-                <w:rPr>
-                  <w:lang w:val="pt-BR"/>
-                </w:rPr>
-                <w:t xml:space="preserve">, M. S.; Al </w:t>
-              </w:r>
-              <w:proofErr w:type="spellStart"/>
-              <w:r>
-                <w:rPr>
-                  <w:lang w:val="pt-BR"/>
-                </w:rPr>
-                <w:t>Montaser</w:t>
-              </w:r>
-              <w:proofErr w:type="spellEnd"/>
-              <w:r>
-                <w:rPr>
-                  <w:lang w:val="pt-BR"/>
-                </w:rPr>
-                <w:t xml:space="preserve">, M. A.; </w:t>
-              </w:r>
-              <w:proofErr w:type="spellStart"/>
-              <w:r>
-                <w:rPr>
-                  <w:lang w:val="pt-BR"/>
-                </w:rPr>
-                <w:t>Chouksey</w:t>
-              </w:r>
-              <w:proofErr w:type="spellEnd"/>
-              <w:r>
-                <w:rPr>
-                  <w:lang w:val="pt-BR"/>
-                </w:rPr>
-                <w:t xml:space="preserve">, A.; </w:t>
-              </w:r>
-              <w:proofErr w:type="spellStart"/>
-              <w:r>
-                <w:rPr>
-                  <w:lang w:val="pt-BR"/>
-                </w:rPr>
-                <w:t>Pant</w:t>
-              </w:r>
-              <w:proofErr w:type="spellEnd"/>
-              <w:r>
-                <w:rPr>
-                  <w:lang w:val="pt-BR"/>
-                </w:rPr>
-                <w:t xml:space="preserve">, L. </w:t>
+              <w:r>
+                <w:rPr>
+                  <w:lang w:val="pt-BR"/>
+                </w:rPr>
+                <w:t xml:space="preserve">Sizan, M. M. H.; Das, B. C.; Shawon, R. E. R.; Rana, M. S.; Al Montaser, M. A.; Chouksey, A.; Pant, L. </w:t>
               </w:r>
               <w:r>
                 <w:rPr>
@@ -2982,115 +1511,7 @@
                   <w:bCs/>
                   <w:lang w:val="pt-BR"/>
                 </w:rPr>
-                <w:t>AI-</w:t>
-              </w:r>
-              <w:proofErr w:type="spellStart"/>
-              <w:r>
-                <w:rPr>
-                  <w:b/>
-                  <w:bCs/>
-                  <w:lang w:val="pt-BR"/>
-                </w:rPr>
-                <w:t>enhanced</w:t>
-              </w:r>
-              <w:proofErr w:type="spellEnd"/>
-              <w:r>
-                <w:rPr>
-                  <w:b/>
-                  <w:bCs/>
-                  <w:lang w:val="pt-BR"/>
-                </w:rPr>
-                <w:t xml:space="preserve"> stock </w:t>
-              </w:r>
-              <w:proofErr w:type="spellStart"/>
-              <w:r>
-                <w:rPr>
-                  <w:b/>
-                  <w:bCs/>
-                  <w:lang w:val="pt-BR"/>
-                </w:rPr>
-                <w:t>market</w:t>
-              </w:r>
-              <w:proofErr w:type="spellEnd"/>
-              <w:r>
-                <w:rPr>
-                  <w:b/>
-                  <w:bCs/>
-                  <w:lang w:val="pt-BR"/>
-                </w:rPr>
-                <w:t xml:space="preserve"> </w:t>
-              </w:r>
-              <w:proofErr w:type="spellStart"/>
-              <w:r>
-                <w:rPr>
-                  <w:b/>
-                  <w:bCs/>
-                  <w:lang w:val="pt-BR"/>
-                </w:rPr>
-                <w:t>prediction</w:t>
-              </w:r>
-              <w:proofErr w:type="spellEnd"/>
-              <w:r>
-                <w:rPr>
-                  <w:b/>
-                  <w:bCs/>
-                  <w:lang w:val="pt-BR"/>
-                </w:rPr>
-                <w:t xml:space="preserve">: </w:t>
-              </w:r>
-              <w:proofErr w:type="spellStart"/>
-              <w:r>
-                <w:rPr>
-                  <w:b/>
-                  <w:bCs/>
-                  <w:lang w:val="pt-BR"/>
-                </w:rPr>
-                <w:t>evaluating</w:t>
-              </w:r>
-              <w:proofErr w:type="spellEnd"/>
-              <w:r>
-                <w:rPr>
-                  <w:b/>
-                  <w:bCs/>
-                  <w:lang w:val="pt-BR"/>
-                </w:rPr>
-                <w:t xml:space="preserve"> machine learning models for financial </w:t>
-              </w:r>
-              <w:proofErr w:type="spellStart"/>
-              <w:r>
-                <w:rPr>
-                  <w:b/>
-                  <w:bCs/>
-                  <w:lang w:val="pt-BR"/>
-                </w:rPr>
-                <w:t>forecasting</w:t>
-              </w:r>
-              <w:proofErr w:type="spellEnd"/>
-              <w:r>
-                <w:rPr>
-                  <w:b/>
-                  <w:bCs/>
-                  <w:lang w:val="pt-BR"/>
-                </w:rPr>
-                <w:t xml:space="preserve"> in </w:t>
-              </w:r>
-              <w:proofErr w:type="spellStart"/>
-              <w:r>
-                <w:rPr>
-                  <w:b/>
-                  <w:bCs/>
-                  <w:lang w:val="pt-BR"/>
-                </w:rPr>
-                <w:t>the</w:t>
-              </w:r>
-              <w:proofErr w:type="spellEnd"/>
-              <w:r>
-                <w:rPr>
-                  <w:b/>
-                  <w:bCs/>
-                  <w:lang w:val="pt-BR"/>
-                </w:rPr>
-                <w:t xml:space="preserve"> USA</w:t>
+                <w:t>AI-enhanced stock market prediction: evaluating machine learning models for financial forecasting in the USA</w:t>
               </w:r>
               <w:r>
                 <w:rPr>
@@ -3098,70 +1519,14 @@
                 </w:rPr>
                 <w:t xml:space="preserve">. </w:t>
               </w:r>
-              <w:proofErr w:type="spellStart"/>
               <w:r>
                 <w:rPr>
                   <w:i/>
                   <w:iCs/>
                   <w:lang w:val="pt-BR"/>
                 </w:rPr>
-                <w:t>Journal</w:t>
-              </w:r>
-              <w:proofErr w:type="spellEnd"/>
-              <w:r>
-                <w:rPr>
-                  <w:i/>
-                  <w:iCs/>
-                  <w:lang w:val="pt-BR"/>
-                </w:rPr>
-                <w:t xml:space="preserve"> </w:t>
-              </w:r>
-              <w:proofErr w:type="spellStart"/>
-              <w:r>
-                <w:rPr>
-                  <w:i/>
-                  <w:iCs/>
-                  <w:lang w:val="pt-BR"/>
-                </w:rPr>
-                <w:t>of</w:t>
-              </w:r>
-              <w:proofErr w:type="spellEnd"/>
-              <w:r>
-                <w:rPr>
-                  <w:i/>
-                  <w:iCs/>
-                  <w:lang w:val="pt-BR"/>
-                </w:rPr>
-                <w:t xml:space="preserve"> Business </w:t>
-              </w:r>
-              <w:proofErr w:type="spellStart"/>
-              <w:r>
-                <w:rPr>
-                  <w:i/>
-                  <w:iCs/>
-                  <w:lang w:val="pt-BR"/>
-                </w:rPr>
-                <w:t>and</w:t>
-              </w:r>
-              <w:proofErr w:type="spellEnd"/>
-              <w:r>
-                <w:rPr>
-                  <w:i/>
-                  <w:iCs/>
-                  <w:lang w:val="pt-BR"/>
-                </w:rPr>
-                <w:t xml:space="preserve"> Management </w:t>
-              </w:r>
-              <w:proofErr w:type="spellStart"/>
-              <w:r>
-                <w:rPr>
-                  <w:i/>
-                  <w:iCs/>
-                  <w:lang w:val="pt-BR"/>
-                </w:rPr>
-                <w:t>Studies</w:t>
-              </w:r>
-              <w:proofErr w:type="spellEnd"/>
+                <w:t>Journal of Business and Management Studies</w:t>
+              </w:r>
               <w:r>
                 <w:rPr>
                   <w:lang w:val="pt-BR"/>
@@ -3175,359 +1540,39 @@
                   <w:lang w:val="pt-BR"/>
                 </w:rPr>
               </w:pPr>
-              <w:proofErr w:type="spellStart"/>
-              <w:r>
-                <w:rPr>
-                  <w:lang w:val="pt-BR"/>
-                </w:rPr>
-                <w:t>Urban</w:t>
-              </w:r>
-              <w:proofErr w:type="spellEnd"/>
-              <w:r>
-                <w:rPr>
-                  <w:lang w:val="pt-BR"/>
-                </w:rPr>
-                <w:t xml:space="preserve">, S.; </w:t>
-              </w:r>
-              <w:proofErr w:type="spellStart"/>
-              <w:r>
-                <w:rPr>
-                  <w:lang w:val="pt-BR"/>
-                </w:rPr>
-                <w:t>Moosbrugger</w:t>
-              </w:r>
-              <w:proofErr w:type="spellEnd"/>
-              <w:r>
-                <w:rPr>
-                  <w:lang w:val="pt-BR"/>
-                </w:rPr>
-                <w:t xml:space="preserve">, N.; </w:t>
-              </w:r>
-              <w:proofErr w:type="spellStart"/>
-              <w:r>
-                <w:rPr>
-                  <w:lang w:val="pt-BR"/>
-                </w:rPr>
-                <w:t>Hellwig</w:t>
-              </w:r>
-              <w:proofErr w:type="spellEnd"/>
-              <w:r>
-                <w:rPr>
-                  <w:lang w:val="pt-BR"/>
-                </w:rPr>
-                <w:t xml:space="preserve">, M.; </w:t>
-              </w:r>
-              <w:proofErr w:type="spellStart"/>
-              <w:r>
-                <w:rPr>
-                  <w:lang w:val="pt-BR"/>
-                </w:rPr>
-                <w:t>Dobler</w:t>
-              </w:r>
-              <w:proofErr w:type="spellEnd"/>
-              <w:r>
-                <w:rPr>
-                  <w:lang w:val="pt-BR"/>
-                </w:rPr>
-                <w:t xml:space="preserve">, M. </w:t>
-              </w:r>
-              <w:proofErr w:type="spellStart"/>
+              <w:r>
+                <w:rPr>
+                  <w:lang w:val="pt-BR"/>
+                </w:rPr>
+                <w:t xml:space="preserve">Urban, S.; Moosbrugger, N.; Hellwig, M.; Dobler, M. </w:t>
+              </w:r>
               <w:r>
                 <w:rPr>
                   <w:b/>
                   <w:bCs/>
                   <w:lang w:val="pt-BR"/>
                 </w:rPr>
-                <w:t>Sustainable</w:t>
-              </w:r>
-              <w:proofErr w:type="spellEnd"/>
-              <w:r>
-                <w:rPr>
-                  <w:b/>
-                  <w:bCs/>
-                  <w:lang w:val="pt-BR"/>
-                </w:rPr>
-                <w:t xml:space="preserve"> </w:t>
-              </w:r>
-              <w:proofErr w:type="spellStart"/>
-              <w:r>
-                <w:rPr>
-                  <w:b/>
-                  <w:bCs/>
-                  <w:lang w:val="pt-BR"/>
-                </w:rPr>
-                <w:t>smart</w:t>
-              </w:r>
-              <w:proofErr w:type="spellEnd"/>
-              <w:r>
-                <w:rPr>
-                  <w:b/>
-                  <w:bCs/>
-                  <w:lang w:val="pt-BR"/>
-                </w:rPr>
-                <w:t xml:space="preserve"> </w:t>
-              </w:r>
-              <w:proofErr w:type="spellStart"/>
-              <w:r>
-                <w:rPr>
-                  <w:b/>
-                  <w:bCs/>
-                  <w:lang w:val="pt-BR"/>
-                </w:rPr>
-                <w:t>services</w:t>
-              </w:r>
-              <w:proofErr w:type="spellEnd"/>
-              <w:r>
-                <w:rPr>
-                  <w:b/>
-                  <w:bCs/>
-                  <w:lang w:val="pt-BR"/>
-                </w:rPr>
-                <w:t xml:space="preserve"> for financial </w:t>
-              </w:r>
-              <w:proofErr w:type="spellStart"/>
-              <w:r>
-                <w:rPr>
-                  <w:b/>
-                  <w:bCs/>
-                  <w:lang w:val="pt-BR"/>
-                </w:rPr>
-                <w:t>institutions</w:t>
-              </w:r>
-              <w:proofErr w:type="spellEnd"/>
-              <w:r>
-                <w:rPr>
-                  <w:b/>
-                  <w:bCs/>
-                  <w:lang w:val="pt-BR"/>
-                </w:rPr>
-                <w:t xml:space="preserve">: a framework </w:t>
-              </w:r>
-              <w:proofErr w:type="spellStart"/>
-              <w:r>
-                <w:rPr>
-                  <w:b/>
-                  <w:bCs/>
-                  <w:lang w:val="pt-BR"/>
-                </w:rPr>
-                <w:t>to</w:t>
-              </w:r>
-              <w:proofErr w:type="spellEnd"/>
-              <w:r>
-                <w:rPr>
-                  <w:b/>
-                  <w:bCs/>
-                  <w:lang w:val="pt-BR"/>
-                </w:rPr>
-                <w:t xml:space="preserve"> </w:t>
-              </w:r>
-              <w:proofErr w:type="spellStart"/>
-              <w:r>
-                <w:rPr>
-                  <w:b/>
-                  <w:bCs/>
-                  <w:lang w:val="pt-BR"/>
-                </w:rPr>
-                <w:t>support</w:t>
-              </w:r>
-              <w:proofErr w:type="spellEnd"/>
-              <w:r>
-                <w:rPr>
-                  <w:b/>
-                  <w:bCs/>
-                  <w:lang w:val="pt-BR"/>
-                </w:rPr>
-                <w:t xml:space="preserve"> banks in ESG </w:t>
-              </w:r>
-              <w:proofErr w:type="spellStart"/>
-              <w:r>
-                <w:rPr>
-                  <w:b/>
-                  <w:bCs/>
-                  <w:lang w:val="pt-BR"/>
-                </w:rPr>
-                <w:t>integration</w:t>
-              </w:r>
-              <w:proofErr w:type="spellEnd"/>
-              <w:r>
-                <w:rPr>
-                  <w:b/>
-                  <w:bCs/>
-                  <w:lang w:val="pt-BR"/>
-                </w:rPr>
-                <w:t xml:space="preserve"> in </w:t>
-              </w:r>
-              <w:proofErr w:type="spellStart"/>
-              <w:r>
-                <w:rPr>
-                  <w:b/>
-                  <w:bCs/>
-                  <w:lang w:val="pt-BR"/>
-                </w:rPr>
-                <w:t>the</w:t>
-              </w:r>
-              <w:proofErr w:type="spellEnd"/>
-              <w:r>
-                <w:rPr>
-                  <w:b/>
-                  <w:bCs/>
-                  <w:lang w:val="pt-BR"/>
-                </w:rPr>
-                <w:t xml:space="preserve"> </w:t>
-              </w:r>
-              <w:proofErr w:type="spellStart"/>
-              <w:r>
-                <w:rPr>
-                  <w:b/>
-                  <w:bCs/>
-                  <w:lang w:val="pt-BR"/>
-                </w:rPr>
-                <w:t>risk</w:t>
-              </w:r>
-              <w:proofErr w:type="spellEnd"/>
-              <w:r>
-                <w:rPr>
-                  <w:b/>
-                  <w:bCs/>
-                  <w:lang w:val="pt-BR"/>
-                </w:rPr>
-                <w:t xml:space="preserve"> </w:t>
-              </w:r>
-              <w:proofErr w:type="spellStart"/>
-              <w:r>
-                <w:rPr>
-                  <w:b/>
-                  <w:bCs/>
-                  <w:lang w:val="pt-BR"/>
-                </w:rPr>
-                <w:t>analysis</w:t>
-              </w:r>
-              <w:proofErr w:type="spellEnd"/>
-              <w:r>
-                <w:rPr>
-                  <w:b/>
-                  <w:bCs/>
-                  <w:lang w:val="pt-BR"/>
-                </w:rPr>
-                <w:t xml:space="preserve"> </w:t>
-              </w:r>
-              <w:proofErr w:type="spellStart"/>
-              <w:r>
-                <w:rPr>
-                  <w:b/>
-                  <w:bCs/>
-                  <w:lang w:val="pt-BR"/>
-                </w:rPr>
-                <w:t>process</w:t>
-              </w:r>
-              <w:proofErr w:type="spellEnd"/>
-              <w:r>
-                <w:rPr>
-                  <w:b/>
-                  <w:bCs/>
-                  <w:lang w:val="pt-BR"/>
-                </w:rPr>
-                <w:t xml:space="preserve"> </w:t>
-              </w:r>
-              <w:proofErr w:type="spellStart"/>
-              <w:r>
-                <w:rPr>
-                  <w:b/>
-                  <w:bCs/>
-                  <w:lang w:val="pt-BR"/>
-                </w:rPr>
-                <w:t>of</w:t>
-              </w:r>
-              <w:proofErr w:type="spellEnd"/>
-              <w:r>
-                <w:rPr>
-                  <w:b/>
-                  <w:bCs/>
-                  <w:lang w:val="pt-BR"/>
-                </w:rPr>
-                <w:t xml:space="preserve"> </w:t>
-              </w:r>
-              <w:proofErr w:type="spellStart"/>
-              <w:r>
-                <w:rPr>
-                  <w:b/>
-                  <w:bCs/>
-                  <w:lang w:val="pt-BR"/>
-                </w:rPr>
-                <w:t>loans</w:t>
-              </w:r>
-              <w:proofErr w:type="spellEnd"/>
+                <w:t>Sustainable smart services for financial institutions: a framework to support banks in ESG integration in the risk analysis process of loans</w:t>
+              </w:r>
               <w:r>
                 <w:rPr>
                   <w:lang w:val="pt-BR"/>
                 </w:rPr>
                 <w:t xml:space="preserve">. In: </w:t>
               </w:r>
-              <w:proofErr w:type="spellStart"/>
               <w:r>
                 <w:rPr>
                   <w:i/>
                   <w:iCs/>
                   <w:lang w:val="pt-BR"/>
                 </w:rPr>
-                <w:t>Smart</w:t>
-              </w:r>
-              <w:proofErr w:type="spellEnd"/>
-              <w:r>
-                <w:rPr>
-                  <w:i/>
-                  <w:iCs/>
-                  <w:lang w:val="pt-BR"/>
-                </w:rPr>
-                <w:t xml:space="preserve"> Services Summit</w:t>
-              </w:r>
-              <w:r>
-                <w:rPr>
-                  <w:lang w:val="pt-BR"/>
-                </w:rPr>
-                <w:t xml:space="preserve">. </w:t>
-              </w:r>
-              <w:proofErr w:type="spellStart"/>
-              <w:r>
-                <w:rPr>
-                  <w:lang w:val="pt-BR"/>
-                </w:rPr>
-                <w:t>Cham</w:t>
-              </w:r>
-              <w:proofErr w:type="spellEnd"/>
-              <w:r>
-                <w:rPr>
-                  <w:lang w:val="pt-BR"/>
-                </w:rPr>
-                <w:t xml:space="preserve">: Springer </w:t>
-              </w:r>
-              <w:proofErr w:type="spellStart"/>
-              <w:r>
-                <w:rPr>
-                  <w:lang w:val="pt-BR"/>
-                </w:rPr>
-                <w:t>Nature</w:t>
-              </w:r>
-              <w:proofErr w:type="spellEnd"/>
-              <w:r>
-                <w:rPr>
-                  <w:lang w:val="pt-BR"/>
-                </w:rPr>
-                <w:t xml:space="preserve"> </w:t>
-              </w:r>
-              <w:proofErr w:type="spellStart"/>
-              <w:r>
-                <w:rPr>
-                  <w:lang w:val="pt-BR"/>
-                </w:rPr>
-                <w:t>Switzerland</w:t>
-              </w:r>
-              <w:proofErr w:type="spellEnd"/>
-              <w:r>
-                <w:rPr>
-                  <w:lang w:val="pt-BR"/>
-                </w:rPr>
-                <w:t>, 2022. p. 143–151.</w:t>
+                <w:t>Smart Services Summit</w:t>
+              </w:r>
+              <w:r>
+                <w:rPr>
+                  <w:lang w:val="pt-BR"/>
+                </w:rPr>
+                <w:t>. Cham: Springer Nature Switzerland, 2022. p. 143–151.</w:t>
               </w:r>
             </w:p>
             <w:p>
@@ -4640,6 +2685,7 @@
   <w:style w:type="character" w:default="1" w:styleId="Fontepargpadro">
     <w:name w:val="Default Paragraph Font"/>
     <w:uiPriority w:val="1"/>
+    <w:semiHidden/>
     <w:unhideWhenUsed/>
   </w:style>
   <w:style w:type="table" w:default="1" w:styleId="Tabelanormal">
@@ -5239,58 +3285,6 @@
 </file>
 
 <file path=customXml/item2.xml><?xml version="1.0" encoding="utf-8"?>
-<b:Sources xmlns:b="http://schemas.openxmlformats.org/officeDocument/2006/bibliography" xmlns="http://schemas.openxmlformats.org/officeDocument/2006/bibliography" SelectedStyle="\APASixthEditionOfficeOnline.xsl" StyleName="APA" Version="6">
-  <b:Source>
-    <b:Tag>Bru17</b:Tag>
-    <b:SourceType>Book</b:SourceType>
-    <b:Guid>{4F015D30-B028-4340-BCD2-1F193C485D1E}</b:Guid>
-    <b:Title>Practical Statistics for Data Scientists: 50 Essential Concepts</b:Title>
-    <b:Year>2017</b:Year>
-    <b:Pages>177,269-270</b:Pages>
-    <b:City>Sebastopol</b:City>
-    <b:Publisher>O'Reilly</b:Publisher>
-    <b:BookTitle>Practical Statistics for Data Scientists: 50 Essential Concepts</b:BookTitle>
-    <b:Author>
-      <b:Author>
-        <b:NameList>
-          <b:Person>
-            <b:Last>Bruce</b:Last>
-            <b:First>Peter</b:First>
-          </b:Person>
-          <b:Person>
-            <b:Last>Bruce</b:Last>
-            <b:First>Andrew</b:First>
-          </b:Person>
-        </b:NameList>
-      </b:Author>
-      <b:BookAuthor>
-        <b:NameList>
-          <b:Person>
-            <b:Last>Bruce</b:Last>
-            <b:First>Peter</b:First>
-          </b:Person>
-          <b:Person>
-            <b:Last>Bruce</b:Last>
-            <b:First>Andrew</b:First>
-          </b:Person>
-        </b:NameList>
-      </b:BookAuthor>
-    </b:Author>
-    <b:RefOrder>1</b:RefOrder>
-  </b:Source>
-</b:Sources>
-</file>
-
-<file path=customXml/item3.xml><?xml version="1.0" encoding="utf-8"?>
-<?mso-contentType ?>
-<FormTemplates xmlns="http://schemas.microsoft.com/sharepoint/v3/contenttype/forms">
-  <Display>DocumentLibraryForm</Display>
-  <Edit>DocumentLibraryForm</Edit>
-  <New>DocumentLibraryForm</New>
-</FormTemplates>
-</file>
-
-<file path=customXml/item4.xml><?xml version="1.0" encoding="utf-8"?>
 <ct:contentTypeSchema xmlns:ct="http://schemas.microsoft.com/office/2006/metadata/contentType" xmlns:ma="http://schemas.microsoft.com/office/2006/metadata/properties/metaAttributes" ct:_="" ma:_="" ma:contentTypeName="Documento" ma:contentTypeID="0x0101008445836416C7C142B9190D37D75D98A9" ma:contentTypeVersion="10" ma:contentTypeDescription="Crie um novo documento." ma:contentTypeScope="" ma:versionID="46ffd406e04f8079ba29262aae37ef90">
   <xsd:schema xmlns:xsd="http://www.w3.org/2001/XMLSchema" xmlns:xs="http://www.w3.org/2001/XMLSchema" xmlns:p="http://schemas.microsoft.com/office/2006/metadata/properties" xmlns:ns2="ab157843-751e-4736-af67-1fc677112fd5" xmlns:ns3="ecafa820-e5d1-45f6-b947-69321225fd2e" targetNamespace="http://schemas.microsoft.com/office/2006/metadata/properties" ma:root="true" ma:fieldsID="f536e7a34482e1c211c535781e745146" ns2:_="" ns3:_="">
     <xsd:import namespace="ab157843-751e-4736-af67-1fc677112fd5"/>
@@ -5479,6 +3473,58 @@
 </ct:contentTypeSchema>
 </file>
 
+<file path=customXml/item3.xml><?xml version="1.0" encoding="utf-8"?>
+<?mso-contentType ?>
+<FormTemplates xmlns="http://schemas.microsoft.com/sharepoint/v3/contenttype/forms">
+  <Display>DocumentLibraryForm</Display>
+  <Edit>DocumentLibraryForm</Edit>
+  <New>DocumentLibraryForm</New>
+</FormTemplates>
+</file>
+
+<file path=customXml/item4.xml><?xml version="1.0" encoding="utf-8"?>
+<b:Sources xmlns:b="http://schemas.openxmlformats.org/officeDocument/2006/bibliography" xmlns="http://schemas.openxmlformats.org/officeDocument/2006/bibliography" SelectedStyle="\APASixthEditionOfficeOnline.xsl" StyleName="APA" Version="6">
+  <b:Source>
+    <b:Tag>Bru17</b:Tag>
+    <b:SourceType>Book</b:SourceType>
+    <b:Guid>{4F015D30-B028-4340-BCD2-1F193C485D1E}</b:Guid>
+    <b:Title>Practical Statistics for Data Scientists: 50 Essential Concepts</b:Title>
+    <b:Year>2017</b:Year>
+    <b:Pages>177,269-270</b:Pages>
+    <b:City>Sebastopol</b:City>
+    <b:Publisher>O'Reilly</b:Publisher>
+    <b:BookTitle>Practical Statistics for Data Scientists: 50 Essential Concepts</b:BookTitle>
+    <b:Author>
+      <b:Author>
+        <b:NameList>
+          <b:Person>
+            <b:Last>Bruce</b:Last>
+            <b:First>Peter</b:First>
+          </b:Person>
+          <b:Person>
+            <b:Last>Bruce</b:Last>
+            <b:First>Andrew</b:First>
+          </b:Person>
+        </b:NameList>
+      </b:Author>
+      <b:BookAuthor>
+        <b:NameList>
+          <b:Person>
+            <b:Last>Bruce</b:Last>
+            <b:First>Peter</b:First>
+          </b:Person>
+          <b:Person>
+            <b:Last>Bruce</b:Last>
+            <b:First>Andrew</b:First>
+          </b:Person>
+        </b:NameList>
+      </b:BookAuthor>
+    </b:Author>
+    <b:RefOrder>1</b:RefOrder>
+  </b:Source>
+</b:Sources>
+</file>
+
 <file path=customXml/itemProps1.xml><?xml version="1.0" encoding="utf-8"?>
 <ds:datastoreItem xmlns:ds="http://schemas.openxmlformats.org/officeDocument/2006/customXml" ds:itemID="{BB4972B1-9F11-475C-8CF7-3891E402FBF6}">
   <ds:schemaRefs>
@@ -5491,22 +3537,6 @@
 </file>
 
 <file path=customXml/itemProps2.xml><?xml version="1.0" encoding="utf-8"?>
-<ds:datastoreItem xmlns:ds="http://schemas.openxmlformats.org/officeDocument/2006/customXml" ds:itemID="{18B8EF2F-2B8D-4962-9F34-C04E5F3DC979}">
-  <ds:schemaRefs>
-    <ds:schemaRef ds:uri="http://schemas.openxmlformats.org/officeDocument/2006/bibliography"/>
-  </ds:schemaRefs>
-</ds:datastoreItem>
-</file>
-
-<file path=customXml/itemProps3.xml><?xml version="1.0" encoding="utf-8"?>
-<ds:datastoreItem xmlns:ds="http://schemas.openxmlformats.org/officeDocument/2006/customXml" ds:itemID="{30EF2D1F-77D2-49B7-873D-59F5D97AF9EB}">
-  <ds:schemaRefs>
-    <ds:schemaRef ds:uri="http://schemas.microsoft.com/sharepoint/v3/contenttype/forms"/>
-  </ds:schemaRefs>
-</ds:datastoreItem>
-</file>
-
-<file path=customXml/itemProps4.xml><?xml version="1.0" encoding="utf-8"?>
 <ds:datastoreItem xmlns:ds="http://schemas.openxmlformats.org/officeDocument/2006/customXml" ds:itemID="{97D016DD-D28C-422F-A883-F43FC80CE21B}">
   <ds:schemaRefs>
     <ds:schemaRef ds:uri="http://schemas.microsoft.com/office/2006/metadata/contentType"/>
@@ -5523,4 +3553,20 @@
     <ds:schemaRef ds:uri="http://schemas.microsoft.com/internal/obd"/>
   </ds:schemaRefs>
 </ds:datastoreItem>
+</file>
+
+<file path=customXml/itemProps3.xml><?xml version="1.0" encoding="utf-8"?>
+<ds:datastoreItem xmlns:ds="http://schemas.openxmlformats.org/officeDocument/2006/customXml" ds:itemID="{30EF2D1F-77D2-49B7-873D-59F5D97AF9EB}">
+  <ds:schemaRefs>
+    <ds:schemaRef ds:uri="http://schemas.microsoft.com/sharepoint/v3/contenttype/forms"/>
+  </ds:schemaRefs>
+</ds:datastoreItem>
+</file>
+
+<file path=customXml/itemProps4.xml><?xml version="1.0" encoding="utf-8"?>
+<ds:datastoreItem xmlns:ds="http://schemas.openxmlformats.org/officeDocument/2006/customXml" ds:itemID="{18B8EF2F-2B8D-4962-9F34-C04E5F3DC979}">
+  <ds:schemaRefs>
+    <ds:schemaRef ds:uri="http://schemas.openxmlformats.org/officeDocument/2006/bibliography"/>
+  </ds:schemaRefs>
+</ds:datastoreItem>
 </file>
</xml_diff>